<commit_message>
primacy of public interest
</commit_message>
<xml_diff>
--- a/TECH1100 - Assessment 2.docx
+++ b/TECH1100 - Assessment 2.docx
@@ -2309,17 +2309,79 @@
       </w:r>
     </w:p>
     <w:p/>
+    <w:p>
+      <w:r>
+        <w:t xml:space="preserve">The gold standard of the ACS Code of Ethics is the Primacy of the Public Interest, which states that IT practitioners must always prioritize the welfare and wellbeing of society </w:t>
+      </w:r>
+      <w:proofErr w:type="gramStart"/>
+      <w:r>
+        <w:t>as a whole over</w:t>
+      </w:r>
+      <w:proofErr w:type="gramEnd"/>
+      <w:r>
+        <w:t xml:space="preserve"> every other factor, including financial gain or their corporate responsibilities. This </w:t>
+      </w:r>
+      <w:proofErr w:type="gramStart"/>
+      <w:r>
+        <w:t>particular principle</w:t>
+      </w:r>
+      <w:proofErr w:type="gramEnd"/>
+      <w:r>
+        <w:t xml:space="preserve"> is especially significant because information and communication technology systems have become a part of critical infrastructure, such as public healthcare and the transportation sector (ACS, 2018).</w:t>
+      </w:r>
+    </w:p>
+    <w:p>
+      <w:r>
+        <w:t>Take an example related to the launch of software in an autonomous car. The development team finds that there is a problem in the software related to pedestrian detection that could go wrong in rainy weather. Yet the management is afraid that they may lose in the stock market and want to be ahead of competitors; thus, they instruct the development team to overlook the problem and launch the software without fixing it.</w:t>
+      </w:r>
+    </w:p>
     <w:p/>
+    <w:p>
+      <w:pPr>
+        <w:pStyle w:val="Heading2"/>
+      </w:pPr>
+      <w:bookmarkStart w:id="4" w:name="_Toc217340044"/>
+      <w:r>
+        <w:t>Enhancement of quality of life</w:t>
+      </w:r>
+      <w:bookmarkEnd w:id="4"/>
+    </w:p>
+    <w:p>
+      <w:r>
+        <w:rPr>
+          <w:highlight w:val="green"/>
+        </w:rPr>
+        <w:t>Rinse and repeat</w:t>
+      </w:r>
+    </w:p>
+    <w:p>
+      <w:pPr>
+        <w:pStyle w:val="Heading2"/>
+      </w:pPr>
+      <w:bookmarkStart w:id="5" w:name="_Toc217340045"/>
+      <w:r>
+        <w:t>Honesty</w:t>
+      </w:r>
+      <w:bookmarkEnd w:id="5"/>
+    </w:p>
+    <w:p>
+      <w:r>
+        <w:rPr>
+          <w:highlight w:val="green"/>
+        </w:rPr>
+        <w:t>Rinse and repeat</w:t>
+      </w:r>
+    </w:p>
     <w:p/>
     <w:p>
       <w:pPr>
         <w:pStyle w:val="Heading2"/>
       </w:pPr>
-      <w:bookmarkStart w:id="4" w:name="_Toc217340044"/>
-      <w:r>
-        <w:t>Enhancement of quality of life</w:t>
-      </w:r>
-      <w:bookmarkEnd w:id="4"/>
+      <w:bookmarkStart w:id="6" w:name="_Toc217340046"/>
+      <w:r>
+        <w:t>Competence</w:t>
+      </w:r>
+      <w:bookmarkEnd w:id="6"/>
     </w:p>
     <w:p>
       <w:r>
@@ -2329,15 +2391,16 @@
         <w:t>Rinse and repeat</w:t>
       </w:r>
     </w:p>
+    <w:p/>
     <w:p>
       <w:pPr>
         <w:pStyle w:val="Heading2"/>
       </w:pPr>
-      <w:bookmarkStart w:id="5" w:name="_Toc217340045"/>
-      <w:r>
-        <w:t>Honesty</w:t>
-      </w:r>
-      <w:bookmarkEnd w:id="5"/>
+      <w:bookmarkStart w:id="7" w:name="_Toc217340047"/>
+      <w:r>
+        <w:t>Professional development</w:t>
+      </w:r>
+      <w:bookmarkEnd w:id="7"/>
     </w:p>
     <w:p>
       <w:r>
@@ -2352,11 +2415,15 @@
       <w:pPr>
         <w:pStyle w:val="Heading2"/>
       </w:pPr>
-      <w:bookmarkStart w:id="6" w:name="_Toc217340046"/>
-      <w:r>
-        <w:t>Competence</w:t>
-      </w:r>
-      <w:bookmarkEnd w:id="6"/>
+      <w:bookmarkStart w:id="8" w:name="_Toc217340048"/>
+      <w:r>
+        <w:lastRenderedPageBreak/>
+        <w:t>P</w:t>
+      </w:r>
+      <w:r>
+        <w:t>rofessionalism</w:t>
+      </w:r>
+      <w:bookmarkEnd w:id="8"/>
     </w:p>
     <w:p>
       <w:r>
@@ -2369,47 +2436,6 @@
     <w:p/>
     <w:p>
       <w:pPr>
-        <w:pStyle w:val="Heading2"/>
-      </w:pPr>
-      <w:bookmarkStart w:id="7" w:name="_Toc217340047"/>
-      <w:r>
-        <w:t>Professional development</w:t>
-      </w:r>
-      <w:bookmarkEnd w:id="7"/>
-    </w:p>
-    <w:p>
-      <w:r>
-        <w:rPr>
-          <w:highlight w:val="green"/>
-        </w:rPr>
-        <w:t>Rinse and repeat</w:t>
-      </w:r>
-    </w:p>
-    <w:p/>
-    <w:p>
-      <w:pPr>
-        <w:pStyle w:val="Heading2"/>
-      </w:pPr>
-      <w:bookmarkStart w:id="8" w:name="_Toc217340048"/>
-      <w:r>
-        <w:t>P</w:t>
-      </w:r>
-      <w:r>
-        <w:t>rofessionalism</w:t>
-      </w:r>
-      <w:bookmarkEnd w:id="8"/>
-    </w:p>
-    <w:p>
-      <w:r>
-        <w:rPr>
-          <w:highlight w:val="green"/>
-        </w:rPr>
-        <w:t>Rinse and repeat</w:t>
-      </w:r>
-    </w:p>
-    <w:p/>
-    <w:p>
-      <w:pPr>
         <w:pStyle w:val="Heading1"/>
       </w:pPr>
       <w:bookmarkStart w:id="9" w:name="_Toc217340049"/>
@@ -2464,7 +2490,6 @@
       </w:pPr>
       <w:bookmarkStart w:id="11" w:name="_Toc217340051"/>
       <w:r>
-        <w:lastRenderedPageBreak/>
         <w:t>Team Collaboration Evidence</w:t>
       </w:r>
       <w:bookmarkEnd w:id="11"/>

</xml_diff>

<commit_message>
pushed the raw data
</commit_message>
<xml_diff>
--- a/TECH1100 - Assessment 2.docx
+++ b/TECH1100 - Assessment 2.docx
@@ -1975,6 +1975,21 @@
       <w:bookmarkEnd w:id="0"/>
     </w:p>
     <w:p>
+      <w:r>
+        <w:t>Information and Communication Technology (ICT) ethics refers to the moral principles that guide the behaviour of professionals who develop and interact with technology. It is a critical component of the industry because technology now drives most human decision-making and interaction. According to Marymount University (2025), ethical frameworks are essential for building trust, ensuring fairness, and managing complex risks such as data privacy and security. By adhering to these ethical standards, IT professionals ensure that technological advancements result in long-term benefits for society rather than causing harm through negligence or misuse.</w:t>
+      </w:r>
+    </w:p>
+    <w:p>
+      <w:r>
+        <w:t>The Role of the Australian Computer Society (ACS)</w:t>
+      </w:r>
+    </w:p>
+    <w:p>
+      <w:r>
+        <w:t>The Australian Computer Society (ACS) serves as the peak professional association for Australia’s technology sector, representing practitioners across business, government, and education. It plays a pivotal role in maintaining the integrity of the industry by setting educational standards, accrediting university courses, and assessing the skills of migrant professionals. Furthermore, the ACS advocates for the growth of the digital economy and enforces a strict Code of Ethics to ensuring that all members prioritise the public interest above personal or commercial gain (Australian Computer Society, 2025).</w:t>
+      </w:r>
+    </w:p>
+    <w:p>
       <w:pPr>
         <w:rPr>
           <w:rFonts w:cs="Arial"/>
@@ -2110,6 +2125,7 @@
       </w:pPr>
       <w:bookmarkStart w:id="1" w:name="_Toc217340041"/>
       <w:r>
+        <w:lastRenderedPageBreak/>
         <w:t>Ethical Framework:</w:t>
       </w:r>
       <w:bookmarkEnd w:id="1"/>
@@ -2175,164 +2191,277 @@
         <w:rPr>
           <w:rFonts w:cs="Arial"/>
         </w:rPr>
-        <w:t xml:space="preserve">Utilitarianism is a type of consequentialist ethics which claims that the rightness or wrongness of an action lies solely in the result that the action produces. The guiding rule behind Utilitarianism can well be attributed to philosophers Jeremy Bentham and John Stuart Mill, which comes in the form of the "Greatest Happiness Principle." This means that the morally right thing to do is to seek that which produces the greatest happiness for the greatest number of people with the least suffering. In other words, no action is right or wrong </w:t>
+        <w:t>Utilitarianism is a consequentialist ethical theory which asserts that the morality of an action is determined solely by its outcome. The core principle, often associated with philosophers Jeremy Bentham and John Stuart Mill, is the "Greatest Happiness Principle." This states that the most ethical action is the one that maximizes overall happiness and minimizes suffering for the greatest number of people. In this framework, no action is intrinsically right or wrong; it is judged purely on whether its consequences produce a net positive benefit for society.</w:t>
+      </w:r>
+      <w:r>
+        <w:rPr>
+          <w:rFonts w:cs="Arial"/>
+        </w:rPr>
+        <w:br/>
+      </w:r>
+      <w:r>
+        <w:rPr>
+          <w:rFonts w:cs="Arial"/>
+        </w:rPr>
+        <w:br/>
+      </w:r>
+      <w:r>
+        <w:rPr>
+          <w:rFonts w:cs="Arial"/>
+        </w:rPr>
+        <w:t xml:space="preserve">Deontology (derived from the Greek </w:t>
+      </w:r>
+      <w:proofErr w:type="spellStart"/>
+      <w:r>
+        <w:rPr>
+          <w:rFonts w:cs="Arial"/>
+        </w:rPr>
+        <w:t>deon</w:t>
+      </w:r>
+      <w:proofErr w:type="spellEnd"/>
+      <w:r>
+        <w:rPr>
+          <w:rFonts w:cs="Arial"/>
+        </w:rPr>
+        <w:t>, meaning "duty") is a normative ethical theory that judges the morality of an action based on its adherence to rules or duties, rather than its consequences. Most famously developed by Immanuel Kant, this framework argues that certain actions (such as lying or breaking a promise) are inherently wrong, regardless of whether they lead to a positive outcome. A deontological approach requires professionals to act according to universal moral laws and professional codes of conduct, viewing these duties as absolute obligations.</w:t>
+      </w:r>
+    </w:p>
+    <w:p>
+      <w:pPr>
+        <w:pStyle w:val="Heading1"/>
+      </w:pPr>
+      <w:bookmarkStart w:id="2" w:name="_Toc217340042"/>
+      <w:r>
+        <w:t>Defence of the Six Acs Values</w:t>
+      </w:r>
+      <w:bookmarkEnd w:id="2"/>
+    </w:p>
+    <w:p>
+      <w:pPr>
+        <w:pStyle w:val="Heading2"/>
+      </w:pPr>
+      <w:bookmarkStart w:id="3" w:name="_Toc217340043"/>
+      <w:r>
+        <w:t>Primacy of public interest</w:t>
+      </w:r>
+      <w:bookmarkEnd w:id="3"/>
+    </w:p>
+    <w:p>
+      <w:pPr>
+        <w:ind w:left="720"/>
+        <w:rPr>
+          <w:highlight w:val="green"/>
+        </w:rPr>
+      </w:pPr>
+      <w:r>
+        <w:rPr>
+          <w:highlight w:val="green"/>
+        </w:rPr>
+        <w:t xml:space="preserve">1. Meaning of the value and </w:t>
       </w:r>
       <w:proofErr w:type="gramStart"/>
       <w:r>
         <w:rPr>
-          <w:rFonts w:cs="Arial"/>
-        </w:rPr>
-        <w:t>in itself but</w:t>
+          <w:highlight w:val="green"/>
+        </w:rPr>
+        <w:t>Why</w:t>
       </w:r>
       <w:proofErr w:type="gramEnd"/>
       <w:r>
         <w:rPr>
-          <w:rFonts w:cs="Arial"/>
-        </w:rPr>
-        <w:t xml:space="preserve"> only in relation to its outcome.</w:t>
-      </w:r>
-    </w:p>
-    <w:p>
-      <w:pPr>
-        <w:pStyle w:val="Heading1"/>
-      </w:pPr>
-      <w:bookmarkStart w:id="2" w:name="_Toc217340042"/>
-      <w:r>
-        <w:t>Defence of the Six Acs Values</w:t>
-      </w:r>
-      <w:bookmarkEnd w:id="2"/>
+          <w:highlight w:val="green"/>
+        </w:rPr>
+        <w:t xml:space="preserve"> is it important</w:t>
+      </w:r>
+    </w:p>
+    <w:p>
+      <w:pPr>
+        <w:ind w:left="720"/>
+        <w:rPr>
+          <w:highlight w:val="green"/>
+        </w:rPr>
+      </w:pPr>
+      <w:r>
+        <w:rPr>
+          <w:highlight w:val="green"/>
+        </w:rPr>
+        <w:t>2. real-world scenarios in ICT</w:t>
+      </w:r>
+    </w:p>
+    <w:p>
+      <w:pPr>
+        <w:ind w:left="720"/>
+        <w:rPr>
+          <w:highlight w:val="green"/>
+        </w:rPr>
+      </w:pPr>
+      <w:r>
+        <w:rPr>
+          <w:highlight w:val="green"/>
+        </w:rPr>
+        <w:t>3. application of ethical framework and justify the action</w:t>
+      </w:r>
+    </w:p>
+    <w:p>
+      <w:pPr>
+        <w:ind w:left="720"/>
+        <w:rPr>
+          <w:highlight w:val="green"/>
+        </w:rPr>
+      </w:pPr>
+      <w:r>
+        <w:rPr>
+          <w:highlight w:val="green"/>
+        </w:rPr>
+        <w:t>4. counter argument, find opposing ethical view why is it bad or risky</w:t>
+      </w:r>
+    </w:p>
+    <w:p>
+      <w:pPr>
+        <w:ind w:left="720"/>
+      </w:pPr>
+      <w:r>
+        <w:rPr>
+          <w:highlight w:val="green"/>
+        </w:rPr>
+        <w:t xml:space="preserve">5. Defend the </w:t>
+      </w:r>
+      <w:proofErr w:type="spellStart"/>
+      <w:r>
+        <w:rPr>
+          <w:highlight w:val="green"/>
+        </w:rPr>
+        <w:t>acs</w:t>
+      </w:r>
+      <w:proofErr w:type="spellEnd"/>
+      <w:r>
+        <w:rPr>
+          <w:highlight w:val="green"/>
+        </w:rPr>
+        <w:t xml:space="preserve"> value – argue why it is ethically professionally correct</w:t>
+      </w:r>
+    </w:p>
+    <w:p/>
+    <w:p>
+      <w:r>
+        <w:t xml:space="preserve">The gold standard of the ACS Code of Ethics is the Primacy of the Public Interest, which states that IT practitioners must always prioritize the welfare and wellbeing of society </w:t>
+      </w:r>
+      <w:proofErr w:type="gramStart"/>
+      <w:r>
+        <w:t>as a whole over</w:t>
+      </w:r>
+      <w:proofErr w:type="gramEnd"/>
+      <w:r>
+        <w:t xml:space="preserve"> every other factor, including financial gain or their corporate </w:t>
+      </w:r>
+      <w:r>
+        <w:lastRenderedPageBreak/>
+        <w:t xml:space="preserve">responsibilities. This </w:t>
+      </w:r>
+      <w:proofErr w:type="gramStart"/>
+      <w:r>
+        <w:t>particular principle</w:t>
+      </w:r>
+      <w:proofErr w:type="gramEnd"/>
+      <w:r>
+        <w:t xml:space="preserve"> is especially significant because information and communication technology systems have become a part of critical infrastructure, such as public healthcare and the transportation sector (ACS, 2018).</w:t>
+      </w:r>
+    </w:p>
+    <w:p>
+      <w:r>
+        <w:t>Take an example related to the launch of software in an autonomous car. The development team finds that there is a problem in the software related to pedestrian detection that could go wrong in rainy weather. Yet the management is afraid that they may lose in the stock market and want to be ahead of competitors; thus, they instruct the development team to overlook the problem and launch the software without fixing it.</w:t>
+      </w:r>
+    </w:p>
+    <w:p>
+      <w:r>
+        <w:t>Using the framework of Utilitarianism, which seeks to achieve the "greatest good for the greatest number" of people (Driver, 2014), it is right to delay the release. In a delay of sorts, a few people’s safety is put at stake; however, thousands of pedestrians’ safety is also jeopardized when flawed code is released. It is evident that the safety of most people is more important than that of a few.</w:t>
+      </w:r>
+    </w:p>
+    <w:p>
+      <w:r>
+        <w:t>Contrary to the former belief, Shareholder Theory advocates state that the paramount duty of a corporation is the maximization of profits on behalf of shareholders. According to them, it is precarious and inefficient on the part of engineers to prioritize the so-called ‘public interest’ at the expense of ‘efficiency’ (Friedman, 1970). According to the critics, engineers’ tendencies to withhold the development of products for the slightest hazards would result in economic losses and the company going into bankruptcy, resulting in the loss of jobs among the company’s employees.</w:t>
+      </w:r>
+    </w:p>
+    <w:p>
+      <w:proofErr w:type="gramStart"/>
+      <w:r>
+        <w:t>In spite of</w:t>
+      </w:r>
+      <w:proofErr w:type="gramEnd"/>
+      <w:r>
+        <w:t xml:space="preserve"> this economic </w:t>
+      </w:r>
+      <w:proofErr w:type="gramStart"/>
+      <w:r>
+        <w:t>counter-argument</w:t>
+      </w:r>
+      <w:proofErr w:type="gramEnd"/>
+      <w:r>
+        <w:t xml:space="preserve">, putting the public interest first is the right course because the I.C.T. industry owes its total reliance on public trust alone. </w:t>
+      </w:r>
+      <w:proofErr w:type="gramStart"/>
+      <w:r>
+        <w:t>In the event that</w:t>
+      </w:r>
+      <w:proofErr w:type="gramEnd"/>
+      <w:r>
+        <w:t xml:space="preserve"> technology results in unnecessary death or injury because of lack of appropriate implementation measures, the public will end up losing faith and trust in technological systems altogether and would instead suffer stricter governmental regulations because of the fall of the reputation and industry at large.</w:t>
+      </w:r>
     </w:p>
     <w:p>
       <w:pPr>
         <w:pStyle w:val="Heading2"/>
       </w:pPr>
-      <w:bookmarkStart w:id="3" w:name="_Toc217340043"/>
-      <w:r>
-        <w:t>Primacy of public interest</w:t>
-      </w:r>
-      <w:bookmarkEnd w:id="3"/>
-    </w:p>
-    <w:p>
-      <w:pPr>
-        <w:ind w:left="720"/>
-        <w:rPr>
-          <w:highlight w:val="green"/>
-        </w:rPr>
-      </w:pPr>
-      <w:r>
-        <w:rPr>
-          <w:highlight w:val="green"/>
-        </w:rPr>
-        <w:t xml:space="preserve">1. Meaning of the value and </w:t>
-      </w:r>
-      <w:proofErr w:type="gramStart"/>
-      <w:r>
-        <w:rPr>
-          <w:highlight w:val="green"/>
-        </w:rPr>
-        <w:t>Why</w:t>
-      </w:r>
-      <w:proofErr w:type="gramEnd"/>
-      <w:r>
-        <w:rPr>
-          <w:highlight w:val="green"/>
-        </w:rPr>
-        <w:t xml:space="preserve"> is it important</w:t>
-      </w:r>
-    </w:p>
-    <w:p>
-      <w:pPr>
-        <w:ind w:left="720"/>
-        <w:rPr>
-          <w:highlight w:val="green"/>
-        </w:rPr>
-      </w:pPr>
-      <w:r>
-        <w:rPr>
-          <w:highlight w:val="green"/>
-        </w:rPr>
-        <w:t>2. real-world scenarios in ICT</w:t>
-      </w:r>
-    </w:p>
-    <w:p>
-      <w:pPr>
-        <w:ind w:left="720"/>
-        <w:rPr>
-          <w:highlight w:val="green"/>
-        </w:rPr>
-      </w:pPr>
-      <w:r>
-        <w:rPr>
-          <w:highlight w:val="green"/>
-        </w:rPr>
-        <w:t>3. application of ethical framework and justify the action</w:t>
-      </w:r>
-    </w:p>
-    <w:p>
-      <w:pPr>
-        <w:ind w:left="720"/>
-        <w:rPr>
-          <w:highlight w:val="green"/>
-        </w:rPr>
-      </w:pPr>
-      <w:r>
-        <w:rPr>
-          <w:highlight w:val="green"/>
-        </w:rPr>
-        <w:t>4. counter argument, find opposing ethical view why is it bad or risky</w:t>
-      </w:r>
-    </w:p>
-    <w:p>
-      <w:pPr>
-        <w:ind w:left="720"/>
-      </w:pPr>
-      <w:r>
-        <w:rPr>
-          <w:highlight w:val="green"/>
-        </w:rPr>
+      <w:bookmarkStart w:id="4" w:name="_Toc217340044"/>
+      <w:r>
+        <w:t>Enhancement of quality of life</w:t>
+      </w:r>
+      <w:bookmarkEnd w:id="4"/>
+    </w:p>
+    <w:p>
+      <w:r>
+        <w:rPr>
+          <w:highlight w:val="green"/>
+        </w:rPr>
+        <w:t>Rinse and repeat</w:t>
+      </w:r>
+    </w:p>
+    <w:p>
+      <w:pPr>
+        <w:pStyle w:val="Heading2"/>
+      </w:pPr>
+      <w:bookmarkStart w:id="5" w:name="_Toc217340045"/>
+      <w:r>
         <w:lastRenderedPageBreak/>
-        <w:t xml:space="preserve">5. Defend the </w:t>
-      </w:r>
-      <w:proofErr w:type="spellStart"/>
-      <w:r>
-        <w:rPr>
-          <w:highlight w:val="green"/>
-        </w:rPr>
-        <w:t>acs</w:t>
-      </w:r>
-      <w:proofErr w:type="spellEnd"/>
-      <w:r>
-        <w:rPr>
-          <w:highlight w:val="green"/>
-        </w:rPr>
-        <w:t xml:space="preserve"> value – argue why it is ethically professionally correct</w:t>
+        <w:t>Honesty</w:t>
+      </w:r>
+      <w:bookmarkEnd w:id="5"/>
+    </w:p>
+    <w:p>
+      <w:r>
+        <w:rPr>
+          <w:highlight w:val="green"/>
+        </w:rPr>
+        <w:t>Rinse and repeat</w:t>
       </w:r>
     </w:p>
     <w:p/>
     <w:p>
-      <w:r>
-        <w:t xml:space="preserve">The gold standard of the ACS Code of Ethics is the Primacy of the Public Interest, which states that IT practitioners must always prioritize the welfare and wellbeing of society </w:t>
-      </w:r>
-      <w:proofErr w:type="gramStart"/>
-      <w:r>
-        <w:t>as a whole over</w:t>
-      </w:r>
-      <w:proofErr w:type="gramEnd"/>
-      <w:r>
-        <w:t xml:space="preserve"> every other factor, including financial gain or their corporate responsibilities. This </w:t>
-      </w:r>
-      <w:proofErr w:type="gramStart"/>
-      <w:r>
-        <w:t>particular principle</w:t>
-      </w:r>
-      <w:proofErr w:type="gramEnd"/>
-      <w:r>
-        <w:t xml:space="preserve"> is especially significant because information and communication technology systems have become a part of critical infrastructure, such as public healthcare and the transportation sector (ACS, 2018).</w:t>
-      </w:r>
-    </w:p>
-    <w:p>
-      <w:r>
-        <w:t>Take an example related to the launch of software in an autonomous car. The development team finds that there is a problem in the software related to pedestrian detection that could go wrong in rainy weather. Yet the management is afraid that they may lose in the stock market and want to be ahead of competitors; thus, they instruct the development team to overlook the problem and launch the software without fixing it.</w:t>
+      <w:pPr>
+        <w:pStyle w:val="Heading2"/>
+      </w:pPr>
+      <w:bookmarkStart w:id="6" w:name="_Toc217340046"/>
+      <w:r>
+        <w:t>Competence</w:t>
+      </w:r>
+      <w:bookmarkEnd w:id="6"/>
+    </w:p>
+    <w:p>
+      <w:r>
+        <w:rPr>
+          <w:highlight w:val="green"/>
+        </w:rPr>
+        <w:t>Rinse and repeat</w:t>
       </w:r>
     </w:p>
     <w:p/>
@@ -2340,11 +2469,11 @@
       <w:pPr>
         <w:pStyle w:val="Heading2"/>
       </w:pPr>
-      <w:bookmarkStart w:id="4" w:name="_Toc217340044"/>
-      <w:r>
-        <w:t>Enhancement of quality of life</w:t>
-      </w:r>
-      <w:bookmarkEnd w:id="4"/>
+      <w:bookmarkStart w:id="7" w:name="_Toc217340047"/>
+      <w:r>
+        <w:t>Professional development</w:t>
+      </w:r>
+      <w:bookmarkEnd w:id="7"/>
     </w:p>
     <w:p>
       <w:r>
@@ -2354,70 +2483,13 @@
         <w:t>Rinse and repeat</w:t>
       </w:r>
     </w:p>
+    <w:p/>
     <w:p>
       <w:pPr>
         <w:pStyle w:val="Heading2"/>
       </w:pPr>
-      <w:bookmarkStart w:id="5" w:name="_Toc217340045"/>
-      <w:r>
-        <w:t>Honesty</w:t>
-      </w:r>
-      <w:bookmarkEnd w:id="5"/>
-    </w:p>
-    <w:p>
-      <w:r>
-        <w:rPr>
-          <w:highlight w:val="green"/>
-        </w:rPr>
-        <w:t>Rinse and repeat</w:t>
-      </w:r>
-    </w:p>
-    <w:p/>
-    <w:p>
-      <w:pPr>
-        <w:pStyle w:val="Heading2"/>
-      </w:pPr>
-      <w:bookmarkStart w:id="6" w:name="_Toc217340046"/>
-      <w:r>
-        <w:t>Competence</w:t>
-      </w:r>
-      <w:bookmarkEnd w:id="6"/>
-    </w:p>
-    <w:p>
-      <w:r>
-        <w:rPr>
-          <w:highlight w:val="green"/>
-        </w:rPr>
-        <w:t>Rinse and repeat</w:t>
-      </w:r>
-    </w:p>
-    <w:p/>
-    <w:p>
-      <w:pPr>
-        <w:pStyle w:val="Heading2"/>
-      </w:pPr>
-      <w:bookmarkStart w:id="7" w:name="_Toc217340047"/>
-      <w:r>
-        <w:t>Professional development</w:t>
-      </w:r>
-      <w:bookmarkEnd w:id="7"/>
-    </w:p>
-    <w:p>
-      <w:r>
-        <w:rPr>
-          <w:highlight w:val="green"/>
-        </w:rPr>
-        <w:t>Rinse and repeat</w:t>
-      </w:r>
-    </w:p>
-    <w:p/>
-    <w:p>
-      <w:pPr>
-        <w:pStyle w:val="Heading2"/>
-      </w:pPr>
       <w:bookmarkStart w:id="8" w:name="_Toc217340048"/>
       <w:r>
-        <w:lastRenderedPageBreak/>
         <w:t>P</w:t>
       </w:r>
       <w:r>

</xml_diff>

<commit_message>
updated and summarized contents
</commit_message>
<xml_diff>
--- a/TECH1100 - Assessment 2.docx
+++ b/TECH1100 - Assessment 2.docx
@@ -2209,230 +2209,246 @@
         <w:rPr>
           <w:rFonts w:cs="Arial"/>
         </w:rPr>
-        <w:t xml:space="preserve">Deontology (derived from the Greek </w:t>
+        <w:t>Deontology</w:t>
+      </w:r>
+      <w:r>
+        <w:rPr>
+          <w:rFonts w:cs="Arial"/>
+        </w:rPr>
+        <w:t xml:space="preserve"> </w:t>
+      </w:r>
+      <w:r>
+        <w:rPr>
+          <w:rFonts w:cs="Arial"/>
+        </w:rPr>
+        <w:t xml:space="preserve">is a normative ethical theory that judges the morality of an action based on its </w:t>
+      </w:r>
+      <w:r>
+        <w:rPr>
+          <w:rFonts w:cs="Arial"/>
+        </w:rPr>
+        <w:t>commitment</w:t>
+      </w:r>
+      <w:r>
+        <w:rPr>
+          <w:rFonts w:cs="Arial"/>
+        </w:rPr>
+        <w:t xml:space="preserve"> to rules or duties, rather than its consequences. Most famously developed by Immanuel Kant, this framework argues that certain actions (such as lying or breaking a promise) are inherently wrong, regardless of whether they lead to a positive outcome. A deontological approach requires professionals to act according to universal moral laws and professional codes of conduct, viewing these duties as absolute obligations.</w:t>
+      </w:r>
+    </w:p>
+    <w:p>
+      <w:pPr>
+        <w:pStyle w:val="Heading1"/>
+      </w:pPr>
+      <w:bookmarkStart w:id="2" w:name="_Toc217340042"/>
+      <w:r>
+        <w:t>Defence of the Six Acs Values</w:t>
+      </w:r>
+      <w:bookmarkEnd w:id="2"/>
+    </w:p>
+    <w:p>
+      <w:pPr>
+        <w:pStyle w:val="Heading2"/>
+      </w:pPr>
+      <w:bookmarkStart w:id="3" w:name="_Toc217340043"/>
+      <w:r>
+        <w:t>Primacy of public interest</w:t>
+      </w:r>
+      <w:bookmarkEnd w:id="3"/>
+    </w:p>
+    <w:p>
+      <w:pPr>
+        <w:ind w:left="720"/>
+        <w:rPr>
+          <w:highlight w:val="green"/>
+        </w:rPr>
+      </w:pPr>
+      <w:r>
+        <w:rPr>
+          <w:highlight w:val="green"/>
+        </w:rPr>
+        <w:t xml:space="preserve">1. Meaning of the value and </w:t>
+      </w:r>
+      <w:proofErr w:type="gramStart"/>
+      <w:r>
+        <w:rPr>
+          <w:highlight w:val="green"/>
+        </w:rPr>
+        <w:t>Why</w:t>
+      </w:r>
+      <w:proofErr w:type="gramEnd"/>
+      <w:r>
+        <w:rPr>
+          <w:highlight w:val="green"/>
+        </w:rPr>
+        <w:t xml:space="preserve"> is it important</w:t>
+      </w:r>
+    </w:p>
+    <w:p>
+      <w:pPr>
+        <w:ind w:left="720"/>
+        <w:rPr>
+          <w:highlight w:val="green"/>
+        </w:rPr>
+      </w:pPr>
+      <w:r>
+        <w:rPr>
+          <w:highlight w:val="green"/>
+        </w:rPr>
+        <w:t>2. real-world scenarios in ICT</w:t>
+      </w:r>
+    </w:p>
+    <w:p>
+      <w:pPr>
+        <w:ind w:left="720"/>
+        <w:rPr>
+          <w:highlight w:val="green"/>
+        </w:rPr>
+      </w:pPr>
+      <w:r>
+        <w:rPr>
+          <w:highlight w:val="green"/>
+        </w:rPr>
+        <w:t>3. application of ethical framework and justify the action</w:t>
+      </w:r>
+    </w:p>
+    <w:p>
+      <w:pPr>
+        <w:ind w:left="720"/>
+        <w:rPr>
+          <w:highlight w:val="green"/>
+        </w:rPr>
+      </w:pPr>
+      <w:r>
+        <w:rPr>
+          <w:highlight w:val="green"/>
+        </w:rPr>
+        <w:t>4. counter argument, find opposing ethical view why is it bad or risky</w:t>
+      </w:r>
+    </w:p>
+    <w:p>
+      <w:pPr>
+        <w:ind w:left="720"/>
+      </w:pPr>
+      <w:r>
+        <w:rPr>
+          <w:highlight w:val="green"/>
+        </w:rPr>
+        <w:t xml:space="preserve">5. Defend the </w:t>
       </w:r>
       <w:proofErr w:type="spellStart"/>
       <w:r>
         <w:rPr>
-          <w:rFonts w:cs="Arial"/>
-        </w:rPr>
-        <w:t>deon</w:t>
+          <w:highlight w:val="green"/>
+        </w:rPr>
+        <w:t>acs</w:t>
       </w:r>
       <w:proofErr w:type="spellEnd"/>
       <w:r>
         <w:rPr>
-          <w:rFonts w:cs="Arial"/>
-        </w:rPr>
-        <w:t>, meaning "duty") is a normative ethical theory that judges the morality of an action based on its adherence to rules or duties, rather than its consequences. Most famously developed by Immanuel Kant, this framework argues that certain actions (such as lying or breaking a promise) are inherently wrong, regardless of whether they lead to a positive outcome. A deontological approach requires professionals to act according to universal moral laws and professional codes of conduct, viewing these duties as absolute obligations.</w:t>
-      </w:r>
-    </w:p>
-    <w:p>
-      <w:pPr>
-        <w:pStyle w:val="Heading1"/>
-      </w:pPr>
-      <w:bookmarkStart w:id="2" w:name="_Toc217340042"/>
-      <w:r>
-        <w:t>Defence of the Six Acs Values</w:t>
-      </w:r>
-      <w:bookmarkEnd w:id="2"/>
+          <w:highlight w:val="green"/>
+        </w:rPr>
+        <w:t xml:space="preserve"> value – argue why it is ethically professionally correct</w:t>
+      </w:r>
+    </w:p>
+    <w:p/>
+    <w:p>
+      <w:r>
+        <w:t xml:space="preserve">The gold standard of the ACS Code of Ethics is the Primacy of the Public Interest, which states that IT practitioners must always prioritize the welfare and wellbeing of society </w:t>
+      </w:r>
+      <w:r>
+        <w:t>over</w:t>
+      </w:r>
+      <w:r>
+        <w:t xml:space="preserve"> every other factor, including financial gain or their corporate responsibilities. This </w:t>
+      </w:r>
+      <w:r>
+        <w:t>principle</w:t>
+      </w:r>
+      <w:r>
+        <w:t xml:space="preserve"> is especially significant because information and </w:t>
+      </w:r>
+      <w:r>
+        <w:lastRenderedPageBreak/>
+        <w:t>communication technology systems have become a part of critical infrastructure, such as public healthcare and the transportation sector (ACS, 2018).</w:t>
+      </w:r>
+    </w:p>
+    <w:p>
+      <w:r>
+        <w:t>Take an example related to the launch of software in an autonomous car. The development team finds that there is a problem in the software related to pedestrian detection that could go wrong in rainy weather. Yet the management is afraid that they may lose in the stock market and want to be ahead of competitors; thus, they instruct the development team to overlook the problem and launch the software without fixing it.</w:t>
+      </w:r>
+    </w:p>
+    <w:p>
+      <w:r>
+        <w:t>Using the framework of Utilitarianism, which seeks to achieve the "greatest good for the greatest number" of people (Driver, 2014), it is right to delay the release. In a delay of sorts, a few people’s safety is put at stake; however, thousands of pedestrians’ safety is also jeopardized when flawed code is released. It is evident that the safety of most people is more important than that of a few.</w:t>
+      </w:r>
+    </w:p>
+    <w:p>
+      <w:r>
+        <w:t xml:space="preserve">Contrary to the former belief, </w:t>
+      </w:r>
+      <w:r>
+        <w:t>Shareholder Theory argues that a company’s primary duty is to maximize profits for its shareholders. From this perspective, prioritizing "public interest" over operational efficiency is seen as a risk; advocates argue that if engineers delay product releases for minor hazards, it could lead to financial ruin, bankruptcy, and widespread job losses.</w:t>
+      </w:r>
+    </w:p>
+    <w:p>
+      <w:r>
+        <w:t>Despite</w:t>
+      </w:r>
+      <w:r>
+        <w:t xml:space="preserve"> this economic </w:t>
+      </w:r>
+      <w:r>
+        <w:t>counterargument</w:t>
+      </w:r>
+      <w:r>
+        <w:t xml:space="preserve">, putting the public interest first is the right course because the I.C.T. industry owes its total reliance on public trust alone. </w:t>
+      </w:r>
+      <w:r>
+        <w:t>If</w:t>
+      </w:r>
+      <w:r>
+        <w:t xml:space="preserve"> technology results in unnecessary death or injury because of lack of appropriate implementation measures, the public will end up losing faith and trust in technological systems altogether and would instead suffer stricter governmental regulations because of the fall of the reputation and industry at large.</w:t>
+      </w:r>
+      <w:r>
+        <w:br/>
+      </w:r>
+      <w:r>
+        <w:br/>
+        <w:t>Case Study:</w:t>
+      </w:r>
+      <w:r>
+        <w:br/>
+      </w:r>
+      <w:r>
+        <w:t>The PwC tax leak scandal exemplifies a breach of the ACS Primacy of Public Interest principle, where commercial profit was prioritized over community welfare. By leaking confidential government data to help clients bypass tax laws, PwC undermined public revenue and the legal system, violating the core professional duty to place the public good above private gain.</w:t>
+      </w:r>
     </w:p>
     <w:p>
       <w:pPr>
         <w:pStyle w:val="Heading2"/>
       </w:pPr>
-      <w:bookmarkStart w:id="3" w:name="_Toc217340043"/>
-      <w:r>
-        <w:t>Primacy of public interest</w:t>
-      </w:r>
-      <w:bookmarkEnd w:id="3"/>
-    </w:p>
-    <w:p>
-      <w:pPr>
-        <w:ind w:left="720"/>
-        <w:rPr>
-          <w:highlight w:val="green"/>
-        </w:rPr>
-      </w:pPr>
-      <w:r>
-        <w:rPr>
-          <w:highlight w:val="green"/>
-        </w:rPr>
-        <w:t xml:space="preserve">1. Meaning of the value and </w:t>
-      </w:r>
-      <w:proofErr w:type="gramStart"/>
-      <w:r>
-        <w:rPr>
-          <w:highlight w:val="green"/>
-        </w:rPr>
-        <w:t>Why</w:t>
-      </w:r>
-      <w:proofErr w:type="gramEnd"/>
-      <w:r>
-        <w:rPr>
-          <w:highlight w:val="green"/>
-        </w:rPr>
-        <w:t xml:space="preserve"> is it important</w:t>
-      </w:r>
-    </w:p>
-    <w:p>
-      <w:pPr>
-        <w:ind w:left="720"/>
-        <w:rPr>
-          <w:highlight w:val="green"/>
-        </w:rPr>
-      </w:pPr>
-      <w:r>
-        <w:rPr>
-          <w:highlight w:val="green"/>
-        </w:rPr>
-        <w:t>2. real-world scenarios in ICT</w:t>
-      </w:r>
-    </w:p>
-    <w:p>
-      <w:pPr>
-        <w:ind w:left="720"/>
-        <w:rPr>
-          <w:highlight w:val="green"/>
-        </w:rPr>
-      </w:pPr>
-      <w:r>
-        <w:rPr>
-          <w:highlight w:val="green"/>
-        </w:rPr>
-        <w:t>3. application of ethical framework and justify the action</w:t>
-      </w:r>
-    </w:p>
-    <w:p>
-      <w:pPr>
-        <w:ind w:left="720"/>
-        <w:rPr>
-          <w:highlight w:val="green"/>
-        </w:rPr>
-      </w:pPr>
-      <w:r>
-        <w:rPr>
-          <w:highlight w:val="green"/>
-        </w:rPr>
-        <w:t>4. counter argument, find opposing ethical view why is it bad or risky</w:t>
-      </w:r>
-    </w:p>
-    <w:p>
-      <w:pPr>
-        <w:ind w:left="720"/>
-      </w:pPr>
-      <w:r>
-        <w:rPr>
-          <w:highlight w:val="green"/>
-        </w:rPr>
-        <w:t xml:space="preserve">5. Defend the </w:t>
-      </w:r>
-      <w:proofErr w:type="spellStart"/>
-      <w:r>
-        <w:rPr>
-          <w:highlight w:val="green"/>
-        </w:rPr>
-        <w:t>acs</w:t>
-      </w:r>
-      <w:proofErr w:type="spellEnd"/>
-      <w:r>
-        <w:rPr>
-          <w:highlight w:val="green"/>
-        </w:rPr>
-        <w:t xml:space="preserve"> value – argue why it is ethically professionally correct</w:t>
-      </w:r>
-    </w:p>
-    <w:p/>
-    <w:p>
-      <w:r>
-        <w:t xml:space="preserve">The gold standard of the ACS Code of Ethics is the Primacy of the Public Interest, which states that IT practitioners must always prioritize the welfare and wellbeing of society </w:t>
-      </w:r>
-      <w:proofErr w:type="gramStart"/>
-      <w:r>
-        <w:t>as a whole over</w:t>
-      </w:r>
-      <w:proofErr w:type="gramEnd"/>
-      <w:r>
-        <w:t xml:space="preserve"> every other factor, including financial gain or their corporate </w:t>
-      </w:r>
+      <w:bookmarkStart w:id="4" w:name="_Toc217340044"/>
       <w:r>
         <w:lastRenderedPageBreak/>
-        <w:t xml:space="preserve">responsibilities. This </w:t>
-      </w:r>
-      <w:proofErr w:type="gramStart"/>
-      <w:r>
-        <w:t>particular principle</w:t>
-      </w:r>
-      <w:proofErr w:type="gramEnd"/>
-      <w:r>
-        <w:t xml:space="preserve"> is especially significant because information and communication technology systems have become a part of critical infrastructure, such as public healthcare and the transportation sector (ACS, 2018).</w:t>
-      </w:r>
-    </w:p>
-    <w:p>
-      <w:r>
-        <w:t>Take an example related to the launch of software in an autonomous car. The development team finds that there is a problem in the software related to pedestrian detection that could go wrong in rainy weather. Yet the management is afraid that they may lose in the stock market and want to be ahead of competitors; thus, they instruct the development team to overlook the problem and launch the software without fixing it.</w:t>
-      </w:r>
-    </w:p>
-    <w:p>
-      <w:r>
-        <w:t>Using the framework of Utilitarianism, which seeks to achieve the "greatest good for the greatest number" of people (Driver, 2014), it is right to delay the release. In a delay of sorts, a few people’s safety is put at stake; however, thousands of pedestrians’ safety is also jeopardized when flawed code is released. It is evident that the safety of most people is more important than that of a few.</w:t>
-      </w:r>
-    </w:p>
-    <w:p>
-      <w:r>
-        <w:t>Contrary to the former belief, Shareholder Theory advocates state that the paramount duty of a corporation is the maximization of profits on behalf of shareholders. According to them, it is precarious and inefficient on the part of engineers to prioritize the so-called ‘public interest’ at the expense of ‘efficiency’ (Friedman, 1970). According to the critics, engineers’ tendencies to withhold the development of products for the slightest hazards would result in economic losses and the company going into bankruptcy, resulting in the loss of jobs among the company’s employees.</w:t>
-      </w:r>
-    </w:p>
-    <w:p>
-      <w:proofErr w:type="gramStart"/>
-      <w:r>
-        <w:t>In spite of</w:t>
-      </w:r>
-      <w:proofErr w:type="gramEnd"/>
-      <w:r>
-        <w:t xml:space="preserve"> this economic </w:t>
-      </w:r>
-      <w:proofErr w:type="gramStart"/>
-      <w:r>
-        <w:t>counter-argument</w:t>
-      </w:r>
-      <w:proofErr w:type="gramEnd"/>
-      <w:r>
-        <w:t xml:space="preserve">, putting the public interest first is the right course because the I.C.T. industry owes its total reliance on public trust alone. </w:t>
-      </w:r>
-      <w:proofErr w:type="gramStart"/>
-      <w:r>
-        <w:t>In the event that</w:t>
-      </w:r>
-      <w:proofErr w:type="gramEnd"/>
-      <w:r>
-        <w:t xml:space="preserve"> technology results in unnecessary death or injury because of lack of appropriate implementation measures, the public will end up losing faith and trust in technological systems altogether and would instead suffer stricter governmental regulations because of the fall of the reputation and industry at large.</w:t>
+        <w:t>Enhancement of quality of life</w:t>
+      </w:r>
+      <w:bookmarkEnd w:id="4"/>
+    </w:p>
+    <w:p>
+      <w:r>
+        <w:rPr>
+          <w:highlight w:val="green"/>
+        </w:rPr>
+        <w:t>Rinse and repeat</w:t>
       </w:r>
     </w:p>
     <w:p>
       <w:pPr>
         <w:pStyle w:val="Heading2"/>
       </w:pPr>
-      <w:bookmarkStart w:id="4" w:name="_Toc217340044"/>
-      <w:r>
-        <w:t>Enhancement of quality of life</w:t>
-      </w:r>
-      <w:bookmarkEnd w:id="4"/>
-    </w:p>
-    <w:p>
-      <w:r>
-        <w:rPr>
-          <w:highlight w:val="green"/>
-        </w:rPr>
-        <w:t>Rinse and repeat</w:t>
-      </w:r>
-    </w:p>
-    <w:p>
-      <w:pPr>
-        <w:pStyle w:val="Heading2"/>
-      </w:pPr>
       <w:bookmarkStart w:id="5" w:name="_Toc217340045"/>
       <w:r>
-        <w:lastRenderedPageBreak/>
         <w:t>Honesty</w:t>
       </w:r>
       <w:bookmarkEnd w:id="5"/>

</xml_diff>